<commit_message>
update on the simulation
</commit_message>
<xml_diff>
--- a/outputs/reports/chapter_4_8_results.docx
+++ b/outputs/reports/chapter_4_8_results.docx
@@ -86,12 +86,12 @@
     </w:p>
     <w:p>
       <w:r>
-        <w:t>**Simulated (database tier):** across 1000 Monte Carlo trials of</w:t>
+        <w:t>**Simulated (database tier):** across 40 Monte Carlo trials of</w:t>
       </w:r>
     </w:p>
     <w:p>
       <w:r>
-        <w:t>5.0 simulated years each, mean *database* availability</w:t>
+        <w:t>2.0 simulated years each, mean *database* availability</w:t>
       </w:r>
     </w:p>
     <w:p>
@@ -131,7 +131,7 @@
     </w:p>
     <w:p>
       <w:r>
-        <w:t>Mean quorum availability was **99.999689%**</w:t>
+        <w:t>Mean quorum availability was **99.999395%**</w:t>
       </w:r>
     </w:p>
     <w:p>
@@ -262,17 +262,17 @@
     </w:p>
     <w:p>
       <w:r>
-        <w:t>Simulation: mean response **49.96 ms**</w:t>
+        <w:t>Simulation: mean response **49.83 ms**</w:t>
       </w:r>
     </w:p>
     <w:p>
       <w:r>
-        <w:t>(p95 of trial means: 149.47 ms);</w:t>
+        <w:t>(p95 of trial means: 148.96 ms);</w:t>
       </w:r>
     </w:p>
     <w:p>
       <w:r>
-        <w:t>fraction of requests meeting the 200 ms SLO ≈ **98.18%**</w:t>
+        <w:t>fraction of requests meeting the 200 ms SLO ≈ **98.24%**</w:t>
       </w:r>
     </w:p>
     <w:p>
@@ -368,7 +368,7 @@
     </w:p>
     <w:p>
       <w:r>
-        <w:t>- **[PASS]** Single-node availability (k1=1, λ_d=0): analytical=0.999001, simulated=0.99898114, |err|=1.99e-05</w:t>
+        <w:t>- **[PASS]** Single-node availability (k1=1, λ_d=0): analytical=0.999001, simulated=0.99899569, |err|=5.31e-06</w:t>
       </w:r>
     </w:p>
     <w:p>
@@ -476,7 +476,7 @@
       <w:r>
         <w:drawing>
           <wp:inline xmlns:a="http://schemas.openxmlformats.org/drawingml/2006/main" xmlns:pic="http://schemas.openxmlformats.org/drawingml/2006/picture">
-            <wp:extent cx="5303520" cy="3144944"/>
+            <wp:extent cx="5303520" cy="3149189"/>
             <wp:docPr id="1" name="Picture 1"/>
             <wp:cNvGraphicFramePr>
               <a:graphicFrameLocks noChangeAspect="1"/>
@@ -497,7 +497,7 @@
                   <pic:spPr>
                     <a:xfrm>
                       <a:off x="0" y="0"/>
-                      <a:ext cx="5303520" cy="3144944"/>
+                      <a:ext cx="5303520" cy="3149189"/>
                     </a:xfrm>
                     <a:prstGeom prst="rect"/>
                   </pic:spPr>

</xml_diff>